<commit_message>
NEE manuscript: add prediction-accuracy and directional/displacement results
- New Results sections: accuracy depends on the task not the algorithm; new records
  displaced polewards with taxon-structured direction
- New Fig 5 legend (wind roses, polar bearing x distance, displacement) and Fig 4c
- Discussion: directional geometry as effort-free corroboration of redistribution
- Methods: directional and displacement analysis; 3 new Extended Data tables

Co-Authored-By: Claude Opus 4.8 <noreply@anthropic.com>
</commit_message>
<xml_diff>
--- a/manuscript/manuscript_NEE_final.docx
+++ b/manuscript/manuscript_NEE_final.docx
@@ -2,7 +2,7 @@
 <file path=word/document.xml><?xml version="1.0" encoding="utf-8"?>
 <w:document xmlns:w="http://schemas.openxmlformats.org/wordprocessingml/2006/main" xmlns:m="http://schemas.openxmlformats.org/officeDocument/2006/math" xmlns:r="http://schemas.openxmlformats.org/officeDocument/2006/relationships" xmlns:o="urn:schemas-microsoft-com:office:office" xmlns:v="urn:schemas-microsoft-com:vml" xmlns:w10="urn:schemas-microsoft-com:office:word" xmlns:a="http://schemas.openxmlformats.org/drawingml/2006/main" xmlns:pic="http://schemas.openxmlformats.org/drawingml/2006/picture" xmlns:wp="http://schemas.openxmlformats.org/drawingml/2006/wordprocessingDrawing">
   <w:body>
-    <w:bookmarkStart w:id="38" w:name="X732cd088e663900491583918cdf8fca26c5e5f1"/>
+    <w:bookmarkStart w:id="41" w:name="X732cd088e663900491583918cdf8fca26c5e5f1"/>
     <w:p>
       <w:pPr>
         <w:pStyle w:val="Heading1"/>
@@ -233,7 +233,7 @@
       </w:r>
     </w:p>
     <w:bookmarkEnd w:id="10"/>
-    <w:bookmarkStart w:id="19" w:name="main"/>
+    <w:bookmarkStart w:id="21" w:name="main"/>
     <w:p>
       <w:pPr>
         <w:pStyle w:val="Heading2"/>
@@ -2031,7 +2031,85 @@
       </w:r>
     </w:p>
     <w:bookmarkEnd w:id="17"/>
-    <w:bookmarkStart w:id="18" w:name="Xb7134690825bd2ab4b59e40f524ebd568290069"/>
+    <w:bookmarkStart w:id="18" w:name="X769a7c11a4ab2e49fb577ecb77b3fefc95b74b5"/>
+    <w:p>
+      <w:pPr>
+        <w:pStyle w:val="Heading3"/>
+      </w:pPr>
+      <w:r>
+        <w:t xml:space="preserve">Prediction accuracy depends on the task, not the algorithm</w:t>
+      </w:r>
+    </w:p>
+    <w:p>
+      <w:pPr>
+        <w:pStyle w:val="FirstParagraph"/>
+      </w:pPr>
+      <w:r>
+        <w:t xml:space="preserve">We validated both model classes on the complete risk set under three regimes</w:t>
+      </w:r>
+      <w:r>
+        <w:t xml:space="preserve"> </w:t>
+      </w:r>
+      <w:r>
+        <w:t xml:space="preserve">(Fig. 4c). For within-domain interpolation the machine-learning model is clearly</w:t>
+      </w:r>
+      <w:r>
+        <w:t xml:space="preserve"> </w:t>
+      </w:r>
+      <w:r>
+        <w:t xml:space="preserve">better (area under the curve 0.774 versus 0.694; precision-recall 0.014 versus</w:t>
+      </w:r>
+      <w:r>
+        <w:t xml:space="preserve"> </w:t>
+      </w:r>
+      <w:r>
+        <w:t xml:space="preserve">0.008). For temporal forecasting and for spatial extrapolation to held-out province</w:t>
+      </w:r>
+      <w:r>
+        <w:t xml:space="preserve"> </w:t>
+      </w:r>
+      <w:r>
+        <w:t xml:space="preserve">blocks, however, the two classes converge (0.615–0.630 and 0.613–0.616): additional</w:t>
+      </w:r>
+      <w:r>
+        <w:t xml:space="preserve"> </w:t>
+      </w:r>
+      <w:r>
+        <w:t xml:space="preserve">flexibility buys nothing once the prediction target leaves the observed domain.</w:t>
+      </w:r>
+      <w:r>
+        <w:t xml:space="preserve"> </w:t>
+      </w:r>
+      <w:r>
+        <w:t xml:space="preserve">Calibration slopes tell the same story, falling from 0.91–0.97 under random folds to</w:t>
+      </w:r>
+      <w:r>
+        <w:t xml:space="preserve"> </w:t>
+      </w:r>
+      <w:r>
+        <w:t xml:space="preserve">0.45–0.65 under temporal and spatial validation, so absolute probabilities — not only</w:t>
+      </w:r>
+      <w:r>
+        <w:t xml:space="preserve"> </w:t>
+      </w:r>
+      <w:r>
+        <w:t xml:space="preserve">rankings — should be treated cautiously outside interpolation. The difficulty of</w:t>
+      </w:r>
+      <w:r>
+        <w:t xml:space="preserve"> </w:t>
+      </w:r>
+      <w:r>
+        <w:t xml:space="preserve">forecasting new records is therefore a property of the data-generating process rather</w:t>
+      </w:r>
+      <w:r>
+        <w:t xml:space="preserve"> </w:t>
+      </w:r>
+      <w:r>
+        <w:t xml:space="preserve">than of any algorithm.</w:t>
+      </w:r>
+    </w:p>
+    <w:bookmarkEnd w:id="18"/>
+    <w:bookmarkStart w:id="19" w:name="Xb7134690825bd2ab4b59e40f524ebd568290069"/>
     <w:p>
       <w:pPr>
         <w:pStyle w:val="Heading3"/>
@@ -2179,9 +2257,304 @@
         <w:t xml:space="preserve">(Spearman ρ ≈ 0.3–0.6).</w:t>
       </w:r>
     </w:p>
-    <w:bookmarkEnd w:id="18"/>
     <w:bookmarkEnd w:id="19"/>
-    <w:bookmarkStart w:id="20" w:name="discussion"/>
+    <w:bookmarkStart w:id="20" w:name="X533c0299d3ba22be4f811b96b712754d33c312a"/>
+    <w:p>
+      <w:pPr>
+        <w:pStyle w:val="Heading3"/>
+      </w:pPr>
+      <w:r>
+        <w:t xml:space="preserve">New records are displaced polewards, but the direction is taxon-structured</w:t>
+      </w:r>
+    </w:p>
+    <w:p>
+      <w:pPr>
+        <w:pStyle w:val="FirstParagraph"/>
+      </w:pPr>
+      <w:r>
+        <w:t xml:space="preserve">If effort-moderated visibility tracks a real redistribution, new records should not</w:t>
+      </w:r>
+      <w:r>
+        <w:t xml:space="preserve"> </w:t>
+      </w:r>
+      <w:r>
+        <w:t xml:space="preserve">fall randomly around historical ranges. Referencing 851 records (564 species) to</w:t>
+      </w:r>
+      <w:r>
+        <w:t xml:space="preserve"> </w:t>
+      </w:r>
+      <w:r>
+        <w:t xml:space="preserve">each species' BirdLife historical range, they are strongly directionally biased</w:t>
+      </w:r>
+      <w:r>
+        <w:t xml:space="preserve"> </w:t>
+      </w:r>
+      <w:r>
+        <w:t xml:space="preserve">(Fig. 5). Relative to range centroids the mean bearing is 55.7° (north-east;</w:t>
+      </w:r>
+      <w:r>
+        <w:t xml:space="preserve"> </w:t>
+      </w:r>
+      <w:r>
+        <w:t xml:space="preserve">concentration</w:t>
+      </w:r>
+      <w:r>
+        <w:t xml:space="preserve"> </w:t>
+      </w:r>
+      <w:r>
+        <w:rPr>
+          <w:i/>
+          <w:iCs/>
+        </w:rPr>
+        <w:t xml:space="preserve">R</w:t>
+      </w:r>
+      <w:r>
+        <w:t xml:space="preserve"> </w:t>
+      </w:r>
+      <w:r>
+        <w:t xml:space="preserve">= 0.270, Rayleigh</w:t>
+      </w:r>
+      <w:r>
+        <w:t xml:space="preserve"> </w:t>
+      </w:r>
+      <w:r>
+        <w:rPr>
+          <w:i/>
+          <w:iCs/>
+        </w:rPr>
+        <w:t xml:space="preserve">P</w:t>
+      </w:r>
+      <w:r>
+        <w:t xml:space="preserve"> </w:t>
+      </w:r>
+      <w:r>
+        <w:t xml:space="preserve">&lt; 0.001) with median displacement 1,273 km;</w:t>
+      </w:r>
+      <w:r>
+        <w:t xml:space="preserve"> </w:t>
+      </w:r>
+      <w:r>
+        <w:t xml:space="preserve">relative to the nearest range edge the mean bearing is 21.1° (nearly due north;</w:t>
+      </w:r>
+      <w:r>
+        <w:t xml:space="preserve"> </w:t>
+      </w:r>
+      <w:r>
+        <w:rPr>
+          <w:i/>
+          <w:iCs/>
+        </w:rPr>
+        <w:t xml:space="preserve">R</w:t>
+      </w:r>
+      <w:r>
+        <w:t xml:space="preserve"> </w:t>
+      </w:r>
+      <w:r>
+        <w:t xml:space="preserve">= 0.355,</w:t>
+      </w:r>
+      <w:r>
+        <w:t xml:space="preserve"> </w:t>
+      </w:r>
+      <w:r>
+        <w:rPr>
+          <w:i/>
+          <w:iCs/>
+        </w:rPr>
+        <w:t xml:space="preserve">P</w:t>
+      </w:r>
+      <w:r>
+        <w:t xml:space="preserve"> </w:t>
+      </w:r>
+      <w:r>
+        <w:t xml:space="preserve">&lt; 0.001) with median displacement 525 km. The edge-referenced</w:t>
+      </w:r>
+      <w:r>
+        <w:t xml:space="preserve"> </w:t>
+      </w:r>
+      <w:r>
+        <w:t xml:space="preserve">distribution is both tighter and more sharply northward — the cleaner signature of</w:t>
+      </w:r>
+      <w:r>
+        <w:t xml:space="preserve"> </w:t>
+      </w:r>
+      <w:r>
+        <w:t xml:space="preserve">range extension — with more than a fifth of all records falling in the single north</w:t>
+      </w:r>
+      <w:r>
+        <w:t xml:space="preserve"> </w:t>
+      </w:r>
+      <w:r>
+        <w:t xml:space="preserve">sector. Ninety-five per cent of the displacement signal is therefore consistent with</w:t>
+      </w:r>
+      <w:r>
+        <w:t xml:space="preserve"> </w:t>
+      </w:r>
+      <w:r>
+        <w:t xml:space="preserve">poleward redistribution, and 81 records (9.5 %) fall inside the historical range and</w:t>
+      </w:r>
+      <w:r>
+        <w:t xml:space="preserve"> </w:t>
+      </w:r>
+      <w:r>
+        <w:t xml:space="preserve">represent within-range detection rather than extension.</w:t>
+      </w:r>
+    </w:p>
+    <w:p>
+      <w:pPr>
+        <w:pStyle w:val="BodyText"/>
+      </w:pPr>
+      <w:r>
+        <w:t xml:space="preserve">The aggregate pattern conceals systematic taxonomic structure. Passerines</w:t>
+      </w:r>
+      <w:r>
+        <w:t xml:space="preserve"> </w:t>
+      </w:r>
+      <w:r>
+        <w:t xml:space="preserve">(</w:t>
+      </w:r>
+      <w:r>
+        <w:rPr>
+          <w:i/>
+          <w:iCs/>
+        </w:rPr>
+        <w:t xml:space="preserve">n</w:t>
+      </w:r>
+      <w:r>
+        <w:t xml:space="preserve"> </w:t>
+      </w:r>
+      <w:r>
+        <w:t xml:space="preserve">= 465) shift east-north-east (66.0°,</w:t>
+      </w:r>
+      <w:r>
+        <w:t xml:space="preserve"> </w:t>
+      </w:r>
+      <w:r>
+        <w:rPr>
+          <w:i/>
+          <w:iCs/>
+        </w:rPr>
+        <w:t xml:space="preserve">R</w:t>
+      </w:r>
+      <w:r>
+        <w:t xml:space="preserve"> </w:t>
+      </w:r>
+      <w:r>
+        <w:t xml:space="preserve">= 0.380,</w:t>
+      </w:r>
+      <w:r>
+        <w:t xml:space="preserve"> </w:t>
+      </w:r>
+      <w:r>
+        <w:rPr>
+          <w:i/>
+          <w:iCs/>
+        </w:rPr>
+        <w:t xml:space="preserve">P</w:t>
+      </w:r>
+      <w:r>
+        <w:t xml:space="preserve"> </w:t>
+      </w:r>
+      <w:r>
+        <w:t xml:space="preserve">&lt; 0.001) and raptors</w:t>
+      </w:r>
+      <w:r>
+        <w:t xml:space="preserve"> </w:t>
+      </w:r>
+      <w:r>
+        <w:t xml:space="preserve">north-east (36.5°,</w:t>
+      </w:r>
+      <w:r>
+        <w:t xml:space="preserve"> </w:t>
+      </w:r>
+      <w:r>
+        <w:rPr>
+          <w:i/>
+          <w:iCs/>
+        </w:rPr>
+        <w:t xml:space="preserve">P</w:t>
+      </w:r>
+      <w:r>
+        <w:t xml:space="preserve"> </w:t>
+      </w:r>
+      <w:r>
+        <w:t xml:space="preserve">= 0.021), whereas shorebirds trend north-west (323.5°,</w:t>
+      </w:r>
+      <w:r>
+        <w:t xml:space="preserve"> </w:t>
+      </w:r>
+      <w:r>
+        <w:rPr>
+          <w:i/>
+          <w:iCs/>
+        </w:rPr>
+        <w:t xml:space="preserve">P</w:t>
+      </w:r>
+      <w:r>
+        <w:t xml:space="preserve"> </w:t>
+      </w:r>
+      <w:r>
+        <w:t xml:space="preserve">= 0.040) and waterfowl are displaced</w:t>
+      </w:r>
+      <w:r>
+        <w:t xml:space="preserve"> </w:t>
+      </w:r>
+      <w:r>
+        <w:rPr>
+          <w:i/>
+          <w:iCs/>
+        </w:rPr>
+        <w:t xml:space="preserve">south-west</w:t>
+      </w:r>
+      <w:r>
+        <w:t xml:space="preserve"> </w:t>
+      </w:r>
+      <w:r>
+        <w:t xml:space="preserve">(196.6°,</w:t>
+      </w:r>
+      <w:r>
+        <w:t xml:space="preserve"> </w:t>
+      </w:r>
+      <w:r>
+        <w:rPr>
+          <w:i/>
+          <w:iCs/>
+        </w:rPr>
+        <w:t xml:space="preserve">P</w:t>
+      </w:r>
+      <w:r>
+        <w:t xml:space="preserve"> </w:t>
+      </w:r>
+      <w:r>
+        <w:t xml:space="preserve">= 0.022) and by</w:t>
+      </w:r>
+      <w:r>
+        <w:t xml:space="preserve"> </w:t>
+      </w:r>
+      <w:r>
+        <w:t xml:space="preserve">the largest distances of any order (median 2,169 km from the centroid, versus</w:t>
+      </w:r>
+      <w:r>
+        <w:t xml:space="preserve"> </w:t>
+      </w:r>
+      <w:r>
+        <w:t xml:space="preserve">1,190 km for passerines). A single "poleward" summary would therefore misdescribe</w:t>
+      </w:r>
+      <w:r>
+        <w:t xml:space="preserve"> </w:t>
+      </w:r>
+      <w:r>
+        <w:t xml:space="preserve">almost half the orders: land birds expand along breeding-range margins while</w:t>
+      </w:r>
+      <w:r>
+        <w:t xml:space="preserve"> </w:t>
+      </w:r>
+      <w:r>
+        <w:t xml:space="preserve">waterbird records accumulate along flyways and toward wintering grounds.</w:t>
+      </w:r>
+    </w:p>
+    <w:bookmarkEnd w:id="20"/>
+    <w:bookmarkEnd w:id="21"/>
+    <w:bookmarkStart w:id="22" w:name="discussion"/>
     <w:p>
       <w:pPr>
         <w:pStyle w:val="Heading2"/>
@@ -2554,6 +2927,74 @@
         <w:pStyle w:val="BodyText"/>
       </w:pPr>
       <w:r>
+        <w:t xml:space="preserve">The directional analysis supplies independent, effort-free corroboration. Nothing</w:t>
+      </w:r>
+      <w:r>
+        <w:t xml:space="preserve"> </w:t>
+      </w:r>
+      <w:r>
+        <w:t xml:space="preserve">in the bearing of a record relative to its species' historical range depends on the</w:t>
+      </w:r>
+      <w:r>
+        <w:t xml:space="preserve"> </w:t>
+      </w:r>
+      <w:r>
+        <w:t xml:space="preserve">hazard model, yet records fall north-east of range centroids and almost due north of</w:t>
+      </w:r>
+      <w:r>
+        <w:t xml:space="preserve"> </w:t>
+      </w:r>
+      <w:r>
+        <w:t xml:space="preserve">range edges, with highly significant angular concentration. That the effort-moderated</w:t>
+      </w:r>
+      <w:r>
+        <w:t xml:space="preserve"> </w:t>
+      </w:r>
+      <w:r>
+        <w:t xml:space="preserve">hazard framework and the geometry of the records point the same way strengthens the</w:t>
+      </w:r>
+      <w:r>
+        <w:t xml:space="preserve"> </w:t>
+      </w:r>
+      <w:r>
+        <w:t xml:space="preserve">claim that new records carry a genuine redistribution signal rather than only an</w:t>
+      </w:r>
+      <w:r>
+        <w:t xml:space="preserve"> </w:t>
+      </w:r>
+      <w:r>
+        <w:t xml:space="preserve">observation signal. The taxonomic structure adds mechanism: passerines and raptors</w:t>
+      </w:r>
+      <w:r>
+        <w:t xml:space="preserve"> </w:t>
+      </w:r>
+      <w:r>
+        <w:t xml:space="preserve">behave as expected of breeding-range expansion, whereas waterfowl move south-west and</w:t>
+      </w:r>
+      <w:r>
+        <w:t xml:space="preserve"> </w:t>
+      </w:r>
+      <w:r>
+        <w:t xml:space="preserve">farthest, consistent with flyway geometry and wintering-ground redistribution rather</w:t>
+      </w:r>
+      <w:r>
+        <w:t xml:space="preserve"> </w:t>
+      </w:r>
+      <w:r>
+        <w:t xml:space="preserve">than poleward breeding expansion. Directional analyses that pool orders will average</w:t>
+      </w:r>
+      <w:r>
+        <w:t xml:space="preserve"> </w:t>
+      </w:r>
+      <w:r>
+        <w:t xml:space="preserve">these opposing signals toward zero.</w:t>
+      </w:r>
+    </w:p>
+    <w:p>
+      <w:pPr>
+        <w:pStyle w:val="BodyText"/>
+      </w:pPr>
+      <w:r>
         <w:t xml:space="preserve">For monitoring under climate change, raw projected hazard is a poor guide to where</w:t>
       </w:r>
       <w:r>
@@ -2721,8 +3162,8 @@
         <w:t xml:space="preserve">learns most where it is currently blindest.</w:t>
       </w:r>
     </w:p>
-    <w:bookmarkEnd w:id="20"/>
-    <w:bookmarkStart w:id="29" w:name="methods"/>
+    <w:bookmarkEnd w:id="22"/>
+    <w:bookmarkStart w:id="32" w:name="methods"/>
     <w:p>
       <w:pPr>
         <w:pStyle w:val="Heading2"/>
@@ -2731,7 +3172,7 @@
         <w:t xml:space="preserve">Methods</w:t>
       </w:r>
     </w:p>
-    <w:bookmarkStart w:id="21" w:name="study-system-and-response-variable"/>
+    <w:bookmarkStart w:id="23" w:name="study-system-and-response-variable"/>
     <w:p>
       <w:pPr>
         <w:pStyle w:val="Heading3"/>
@@ -2766,8 +3207,8 @@
         <w:t xml:space="preserve">unit, that unit leaves the species' risk set in later years.</w:t>
       </w:r>
     </w:p>
-    <w:bookmarkEnd w:id="21"/>
-    <w:bookmarkStart w:id="22" w:name="X4796a602046aac5df5a8d9c1bb711b66a34822e"/>
+    <w:bookmarkEnd w:id="23"/>
+    <w:bookmarkStart w:id="24" w:name="X4796a602046aac5df5a8d9c1bb711b66a34822e"/>
     <w:p>
       <w:pPr>
         <w:pStyle w:val="Heading3"/>
@@ -2832,8 +3273,8 @@
         <w:t xml:space="preserve">lacking the headline climate or effort covariate.</w:t>
       </w:r>
     </w:p>
-    <w:bookmarkEnd w:id="22"/>
-    <w:bookmarkStart w:id="23" w:name="climate-and-effort-proxies"/>
+    <w:bookmarkEnd w:id="24"/>
+    <w:bookmarkStart w:id="25" w:name="climate-and-effort-proxies"/>
     <w:p>
       <w:pPr>
         <w:pStyle w:val="Heading3"/>
@@ -2904,8 +3345,8 @@
         <w:t xml:space="preserve">Bird-Watching panel⁵.</w:t>
       </w:r>
     </w:p>
-    <w:bookmarkEnd w:id="23"/>
-    <w:bookmarkStart w:id="24" w:name="hazard-models-and-decomposition"/>
+    <w:bookmarkEnd w:id="25"/>
+    <w:bookmarkStart w:id="26" w:name="hazard-models-and-decomposition"/>
     <w:p>
       <w:pPr>
         <w:pStyle w:val="Heading3"/>
@@ -3030,8 +3471,8 @@
         <w:t xml:space="preserve">gain on the same complete risk sets.</w:t>
       </w:r>
     </w:p>
-    <w:bookmarkEnd w:id="24"/>
-    <w:bookmarkStart w:id="25" w:name="prediction-and-projection"/>
+    <w:bookmarkEnd w:id="26"/>
+    <w:bookmarkStart w:id="27" w:name="prediction-and-projection"/>
     <w:p>
       <w:pPr>
         <w:pStyle w:val="Heading3"/>
@@ -3108,13 +3549,95 @@
         <w:t xml:space="preserve">nine-dash line.</w:t>
       </w:r>
     </w:p>
-    <w:bookmarkEnd w:id="25"/>
-    <w:bookmarkStart w:id="28" w:name="reproducibility"/>
+    <w:bookmarkEnd w:id="27"/>
+    <w:bookmarkStart w:id="28" w:name="directional-and-displacement-analysis"/>
     <w:p>
       <w:pPr>
         <w:pStyle w:val="Heading3"/>
       </w:pPr>
       <w:r>
+        <w:t xml:space="preserve">Directional and displacement analysis</w:t>
+      </w:r>
+    </w:p>
+    <w:p>
+      <w:pPr>
+        <w:pStyle w:val="FirstParagraph"/>
+      </w:pPr>
+      <w:r>
+        <w:t xml:space="preserve">New-record coordinates were referenced to each species' BirdLife (Birds of the World</w:t>
+      </w:r>
+      <w:r>
+        <w:t xml:space="preserve"> </w:t>
+      </w:r>
+      <w:r>
+        <w:t xml:space="preserve">2024) historical range polygon. For every record we computed the bearing and</w:t>
+      </w:r>
+      <w:r>
+        <w:t xml:space="preserve"> </w:t>
+      </w:r>
+      <w:r>
+        <w:t xml:space="preserve">great-circle distance to the range centroid and to the nearest point on the range</w:t>
+      </w:r>
+      <w:r>
+        <w:t xml:space="preserve"> </w:t>
+      </w:r>
+      <w:r>
+        <w:t xml:space="preserve">edge, retaining 851 records (564 species) with usable polygons. Bearings were binned</w:t>
+      </w:r>
+      <w:r>
+        <w:t xml:space="preserve"> </w:t>
+      </w:r>
+      <w:r>
+        <w:t xml:space="preserve">into 16 compass sectors for display and summarised with circular statistics: the mean</w:t>
+      </w:r>
+      <w:r>
+        <w:t xml:space="preserve"> </w:t>
+      </w:r>
+      <w:r>
+        <w:t xml:space="preserve">resultant direction, the concentration</w:t>
+      </w:r>
+      <w:r>
+        <w:t xml:space="preserve"> </w:t>
+      </w:r>
+      <w:r>
+        <w:rPr>
+          <w:i/>
+          <w:iCs/>
+        </w:rPr>
+        <w:t xml:space="preserve">R</w:t>
+      </w:r>
+      <w:r>
+        <w:t xml:space="preserve"> </w:t>
+      </w:r>
+      <w:r>
+        <w:t xml:space="preserve">and a Rayleigh test of angular uniformity.</w:t>
+      </w:r>
+      <w:r>
+        <w:t xml:space="preserve"> </w:t>
+      </w:r>
+      <w:r>
+        <w:t xml:space="preserve">Records falling inside the historical range have an edge distance of zero and were</w:t>
+      </w:r>
+      <w:r>
+        <w:t xml:space="preserve"> </w:t>
+      </w:r>
+      <w:r>
+        <w:t xml:space="preserve">retained and reported separately rather than discarded. Displacement distributions</w:t>
+      </w:r>
+      <w:r>
+        <w:t xml:space="preserve"> </w:t>
+      </w:r>
+      <w:r>
+        <w:t xml:space="preserve">were compared across taxonomic orders with at least 25 records.</w:t>
+      </w:r>
+    </w:p>
+    <w:bookmarkEnd w:id="28"/>
+    <w:bookmarkStart w:id="31" w:name="reproducibility"/>
+    <w:p>
+      <w:pPr>
+        <w:pStyle w:val="Heading3"/>
+      </w:pPr>
+      <w:r>
         <w:t xml:space="preserve">Reproducibility</w:t>
       </w:r>
     </w:p>
@@ -3140,7 +3663,7 @@
       <w:r>
         <w:t xml:space="preserve"> </w:t>
       </w:r>
-      <w:hyperlink r:id="rId26">
+      <w:hyperlink r:id="rId29">
         <w:r>
           <w:rPr>
             <w:rStyle w:val="Hyperlink"/>
@@ -3163,7 +3686,7 @@
       <w:r>
         <w:t xml:space="preserve"> </w:t>
       </w:r>
-      <w:hyperlink r:id="rId27">
+      <w:hyperlink r:id="rId30">
         <w:r>
           <w:rPr>
             <w:rStyle w:val="Hyperlink"/>
@@ -3178,9 +3701,9 @@
         <w:t xml:space="preserve">(manuscript and main analysis).</w:t>
       </w:r>
     </w:p>
-    <w:bookmarkEnd w:id="28"/>
-    <w:bookmarkEnd w:id="29"/>
-    <w:bookmarkStart w:id="30" w:name="data-availability"/>
+    <w:bookmarkEnd w:id="31"/>
+    <w:bookmarkEnd w:id="32"/>
+    <w:bookmarkStart w:id="33" w:name="data-availability"/>
     <w:p>
       <w:pPr>
         <w:pStyle w:val="Heading2"/>
@@ -3221,8 +3744,8 @@
         <w:t xml:space="preserve">Ministry of Natural Resources of China.</w:t>
       </w:r>
     </w:p>
-    <w:bookmarkEnd w:id="30"/>
-    <w:bookmarkStart w:id="31" w:name="code-availability"/>
+    <w:bookmarkEnd w:id="33"/>
+    <w:bookmarkStart w:id="34" w:name="code-availability"/>
     <w:p>
       <w:pPr>
         <w:pStyle w:val="Heading2"/>
@@ -3245,8 +3768,8 @@
         <w:t xml:space="preserve">repositories above and will be archived at Zenodo on acceptance.</w:t>
       </w:r>
     </w:p>
-    <w:bookmarkEnd w:id="31"/>
-    <w:bookmarkStart w:id="32" w:name="references"/>
+    <w:bookmarkEnd w:id="34"/>
+    <w:bookmarkStart w:id="35" w:name="references"/>
     <w:p>
       <w:pPr>
         <w:pStyle w:val="Heading2"/>
@@ -3703,8 +4226,8 @@
         <w:t xml:space="preserve">(Geo Books, 1984).</w:t>
       </w:r>
     </w:p>
-    <w:bookmarkEnd w:id="32"/>
-    <w:bookmarkStart w:id="34" w:name="figures"/>
+    <w:bookmarkEnd w:id="35"/>
+    <w:bookmarkStart w:id="37" w:name="figures"/>
     <w:p>
       <w:pPr>
         <w:pStyle w:val="Heading2"/>
@@ -4228,6 +4751,31 @@
       </w:r>
       <w:r>
         <w:rPr>
+          <w:b/>
+          <w:bCs/>
+        </w:rPr>
+        <w:t xml:space="preserve">c</w:t>
+      </w:r>
+      <w:r>
+        <w:t xml:space="preserve">, Model accuracy on the complete risk set by validation regime:</w:t>
+      </w:r>
+      <w:r>
+        <w:t xml:space="preserve"> </w:t>
+      </w:r>
+      <w:r>
+        <w:t xml:space="preserve">machine learning wins at interpolation (0.774 vs 0.694) but the classes converge for</w:t>
+      </w:r>
+      <w:r>
+        <w:t xml:space="preserve"> </w:t>
+      </w:r>
+      <w:r>
+        <w:t xml:space="preserve">temporal forecasting (0.615–0.630) and spatial extrapolation (0.613–0.616).</w:t>
+      </w:r>
+      <w:r>
+        <w:t xml:space="preserve"> </w:t>
+      </w:r>
+      <w:r>
+        <w:rPr>
           <w:i/>
           <w:iCs/>
         </w:rPr>
@@ -4253,10 +4801,359 @@
           <w:i/>
           <w:iCs/>
         </w:rPr>
+        <w:t xml:space="preserve">,</w:t>
+      </w:r>
+      <w:r>
+        <w:rPr>
+          <w:i/>
+          <w:iCs/>
+        </w:rPr>
+        <w:t xml:space="preserve"> </w:t>
+      </w:r>
+      <w:r>
+        <w:rPr>
+          <w:rStyle w:val="VerbatimChar"/>
+          <w:i/>
+          <w:iCs/>
+        </w:rPr>
+        <w:t xml:space="preserve">Fig_H_model_accuracy</w:t>
+      </w:r>
+      <w:r>
+        <w:rPr>
+          <w:i/>
+          <w:iCs/>
+        </w:rPr>
+        <w:t xml:space="preserve">; province projection maps</w:t>
+      </w:r>
+      <w:r>
+        <w:rPr>
+          <w:i/>
+          <w:iCs/>
+        </w:rPr>
+        <w:t xml:space="preserve"> </w:t>
+      </w:r>
+      <w:r>
+        <w:rPr>
+          <w:i/>
+          <w:iCs/>
+        </w:rPr>
+        <w:t xml:space="preserve">in</w:t>
+      </w:r>
+      <w:r>
+        <w:rPr>
+          <w:i/>
+          <w:iCs/>
+        </w:rPr>
+        <w:t xml:space="preserve"> </w:t>
+      </w:r>
+      <w:r>
+        <w:rPr>
+          <w:rStyle w:val="VerbatimChar"/>
+          <w:i/>
+          <w:iCs/>
+        </w:rPr>
+        <w:t xml:space="preserve">Fig_G_future_maps_mech</w:t>
+      </w:r>
+      <w:r>
+        <w:rPr>
+          <w:i/>
+          <w:iCs/>
+        </w:rPr>
+        <w:t xml:space="preserve"> </w:t>
+      </w:r>
+      <w:r>
+        <w:rPr>
+          <w:i/>
+          <w:iCs/>
+        </w:rPr>
+        <w:t xml:space="preserve">and</w:t>
+      </w:r>
+      <w:r>
+        <w:rPr>
+          <w:i/>
+          <w:iCs/>
+        </w:rPr>
+        <w:t xml:space="preserve"> </w:t>
+      </w:r>
+      <w:r>
+        <w:rPr>
+          <w:rStyle w:val="VerbatimChar"/>
+          <w:i/>
+          <w:iCs/>
+        </w:rPr>
+        <w:t xml:space="preserve">Fig_G_future_maps_ml</w:t>
+      </w:r>
+      <w:r>
+        <w:rPr>
+          <w:i/>
+          <w:iCs/>
+        </w:rPr>
         <w:t xml:space="preserve">.</w:t>
       </w:r>
     </w:p>
-    <w:bookmarkStart w:id="33" w:name="extended-data"/>
+    <w:p>
+      <w:pPr>
+        <w:pStyle w:val="BodyText"/>
+      </w:pPr>
+      <w:r>
+        <w:rPr>
+          <w:b/>
+          <w:bCs/>
+        </w:rPr>
+        <w:t xml:space="preserve">Fig. 5 | New records are displaced polewards, with taxon-specific directions.</w:t>
+      </w:r>
+      <w:r>
+        <w:t xml:space="preserve"> </w:t>
+      </w:r>
+      <w:r>
+        <w:rPr>
+          <w:b/>
+          <w:bCs/>
+        </w:rPr>
+        <w:t xml:space="preserve">a</w:t>
+      </w:r>
+      <w:r>
+        <w:t xml:space="preserve">, Sixteen-sector wind roses of record bearing relative to the historical range</w:t>
+      </w:r>
+      <w:r>
+        <w:t xml:space="preserve"> </w:t>
+      </w:r>
+      <w:r>
+        <w:t xml:space="preserve">centroid (mean 55.7°,</w:t>
+      </w:r>
+      <w:r>
+        <w:t xml:space="preserve"> </w:t>
+      </w:r>
+      <w:r>
+        <w:rPr>
+          <w:i/>
+          <w:iCs/>
+        </w:rPr>
+        <w:t xml:space="preserve">R</w:t>
+      </w:r>
+      <w:r>
+        <w:t xml:space="preserve"> </w:t>
+      </w:r>
+      <w:r>
+        <w:t xml:space="preserve">= 0.270) and the nearest range edge (mean 21.1°,</w:t>
+      </w:r>
+      <w:r>
+        <w:t xml:space="preserve"> </w:t>
+      </w:r>
+      <w:r>
+        <w:rPr>
+          <w:i/>
+          <w:iCs/>
+        </w:rPr>
+        <w:t xml:space="preserve">R</w:t>
+      </w:r>
+      <w:r>
+        <w:t xml:space="preserve"> </w:t>
+      </w:r>
+      <w:r>
+        <w:t xml:space="preserve">= 0.355); both Rayleigh</w:t>
+      </w:r>
+      <w:r>
+        <w:t xml:space="preserve"> </w:t>
+      </w:r>
+      <w:r>
+        <w:rPr>
+          <w:i/>
+          <w:iCs/>
+        </w:rPr>
+        <w:t xml:space="preserve">P</w:t>
+      </w:r>
+      <w:r>
+        <w:t xml:space="preserve"> </w:t>
+      </w:r>
+      <w:r>
+        <w:t xml:space="preserve">&lt; 0.001,</w:t>
+      </w:r>
+      <w:r>
+        <w:t xml:space="preserve"> </w:t>
+      </w:r>
+      <w:r>
+        <w:rPr>
+          <w:i/>
+          <w:iCs/>
+        </w:rPr>
+        <w:t xml:space="preserve">n</w:t>
+      </w:r>
+      <w:r>
+        <w:t xml:space="preserve"> </w:t>
+      </w:r>
+      <w:r>
+        <w:t xml:space="preserve">= 851 records.</w:t>
+      </w:r>
+      <w:r>
+        <w:t xml:space="preserve"> </w:t>
+      </w:r>
+      <w:r>
+        <w:rPr>
+          <w:b/>
+          <w:bCs/>
+        </w:rPr>
+        <w:t xml:space="preserve">b</w:t>
+      </w:r>
+      <w:r>
+        <w:t xml:space="preserve">, Composite roses by</w:t>
+      </w:r>
+      <w:r>
+        <w:t xml:space="preserve"> </w:t>
+      </w:r>
+      <w:r>
+        <w:t xml:space="preserve">taxonomic order: passerines east-north-east, raptors north-east, shorebirds</w:t>
+      </w:r>
+      <w:r>
+        <w:t xml:space="preserve"> </w:t>
+      </w:r>
+      <w:r>
+        <w:t xml:space="preserve">north-west and waterfowl south-west.</w:t>
+      </w:r>
+      <w:r>
+        <w:t xml:space="preserve"> </w:t>
+      </w:r>
+      <w:r>
+        <w:rPr>
+          <w:b/>
+          <w:bCs/>
+        </w:rPr>
+        <w:t xml:space="preserve">c</w:t>
+      </w:r>
+      <w:r>
+        <w:t xml:space="preserve">, Polar bearing × distance view with mean</w:t>
+      </w:r>
+      <w:r>
+        <w:t xml:space="preserve"> </w:t>
+      </w:r>
+      <w:r>
+        <w:t xml:space="preserve">vectors.</w:t>
+      </w:r>
+      <w:r>
+        <w:t xml:space="preserve"> </w:t>
+      </w:r>
+      <w:r>
+        <w:rPr>
+          <w:b/>
+          <w:bCs/>
+        </w:rPr>
+        <w:t xml:space="preserve">d</w:t>
+      </w:r>
+      <w:r>
+        <w:t xml:space="preserve">, Displacement distributions by order and cumulative distributions;</w:t>
+      </w:r>
+      <w:r>
+        <w:t xml:space="preserve"> </w:t>
+      </w:r>
+      <w:r>
+        <w:t xml:space="preserve">median 1,273 km from the centroid and 525 km beyond the nearest edge, with 81 of 851</w:t>
+      </w:r>
+      <w:r>
+        <w:t xml:space="preserve"> </w:t>
+      </w:r>
+      <w:r>
+        <w:t xml:space="preserve">records (9.5 %) inside the historical range.</w:t>
+      </w:r>
+      <w:r>
+        <w:t xml:space="preserve"> </w:t>
+      </w:r>
+      <w:r>
+        <w:rPr>
+          <w:i/>
+          <w:iCs/>
+        </w:rPr>
+        <w:t xml:space="preserve">Source:</w:t>
+      </w:r>
+      <w:r>
+        <w:rPr>
+          <w:i/>
+          <w:iCs/>
+        </w:rPr>
+        <w:t xml:space="preserve"> </w:t>
+      </w:r>
+      <w:r>
+        <w:rPr>
+          <w:rStyle w:val="VerbatimChar"/>
+          <w:i/>
+          <w:iCs/>
+        </w:rPr>
+        <w:t xml:space="preserve">Fig_I_windrose_overall</w:t>
+      </w:r>
+      <w:r>
+        <w:rPr>
+          <w:i/>
+          <w:iCs/>
+        </w:rPr>
+        <w:t xml:space="preserve">,</w:t>
+      </w:r>
+      <w:r>
+        <w:rPr>
+          <w:i/>
+          <w:iCs/>
+        </w:rPr>
+        <w:t xml:space="preserve"> </w:t>
+      </w:r>
+      <w:r>
+        <w:rPr>
+          <w:rStyle w:val="VerbatimChar"/>
+          <w:i/>
+          <w:iCs/>
+        </w:rPr>
+        <w:t xml:space="preserve">Fig_I_windrose_by_order</w:t>
+      </w:r>
+      <w:r>
+        <w:rPr>
+          <w:i/>
+          <w:iCs/>
+        </w:rPr>
+        <w:t xml:space="preserve">,</w:t>
+      </w:r>
+      <w:r>
+        <w:rPr>
+          <w:i/>
+          <w:iCs/>
+        </w:rPr>
+        <w:t xml:space="preserve"> </w:t>
+      </w:r>
+      <w:r>
+        <w:rPr>
+          <w:rStyle w:val="VerbatimChar"/>
+          <w:i/>
+          <w:iCs/>
+        </w:rPr>
+        <w:t xml:space="preserve">Fig_J_polar_bearing_distance</w:t>
+      </w:r>
+      <w:r>
+        <w:rPr>
+          <w:i/>
+          <w:iCs/>
+        </w:rPr>
+        <w:t xml:space="preserve">,</w:t>
+      </w:r>
+      <w:r>
+        <w:rPr>
+          <w:i/>
+          <w:iCs/>
+        </w:rPr>
+        <w:t xml:space="preserve"> </w:t>
+      </w:r>
+      <w:r>
+        <w:rPr>
+          <w:rStyle w:val="VerbatimChar"/>
+          <w:i/>
+          <w:iCs/>
+        </w:rPr>
+        <w:t xml:space="preserve">Fig_K_distance_distributions</w:t>
+      </w:r>
+      <w:r>
+        <w:rPr>
+          <w:i/>
+          <w:iCs/>
+        </w:rPr>
+        <w:t xml:space="preserve">.</w:t>
+      </w:r>
+    </w:p>
+    <w:bookmarkStart w:id="36" w:name="extended-data"/>
     <w:p>
       <w:pPr>
         <w:pStyle w:val="Heading3"/>
@@ -4651,10 +5548,109 @@
           </w:p>
         </w:tc>
       </w:tr>
+      <w:tr>
+        <w:tc>
+          <w:tcPr/>
+          <w:p>
+            <w:pPr>
+              <w:pStyle w:val="Compact"/>
+            </w:pPr>
+            <w:r>
+              <w:t xml:space="preserve">ED Table 9</w:t>
+            </w:r>
+          </w:p>
+        </w:tc>
+        <w:tc>
+          <w:tcPr/>
+          <w:p>
+            <w:pPr>
+              <w:pStyle w:val="Compact"/>
+            </w:pPr>
+            <w:r>
+              <w:t xml:space="preserve">Model accuracy by validation regime, including folds (</w:t>
+            </w:r>
+            <w:r>
+              <w:rPr>
+                <w:rStyle w:val="VerbatimChar"/>
+              </w:rPr>
+              <w:t xml:space="preserve">table_H_model_accuracy*.csv</w:t>
+            </w:r>
+            <w:r>
+              <w:t xml:space="preserve">)</w:t>
+            </w:r>
+          </w:p>
+        </w:tc>
+      </w:tr>
+      <w:tr>
+        <w:tc>
+          <w:tcPr/>
+          <w:p>
+            <w:pPr>
+              <w:pStyle w:val="Compact"/>
+            </w:pPr>
+            <w:r>
+              <w:t xml:space="preserve">ED Table 10</w:t>
+            </w:r>
+          </w:p>
+        </w:tc>
+        <w:tc>
+          <w:tcPr/>
+          <w:p>
+            <w:pPr>
+              <w:pStyle w:val="Compact"/>
+            </w:pPr>
+            <w:r>
+              <w:t xml:space="preserve">Directional summary: mean bearings, concentration and Rayleigh tests (</w:t>
+            </w:r>
+            <w:r>
+              <w:rPr>
+                <w:rStyle w:val="VerbatimChar"/>
+              </w:rPr>
+              <w:t xml:space="preserve">table_I_directional_summary.csv</w:t>
+            </w:r>
+            <w:r>
+              <w:t xml:space="preserve">)</w:t>
+            </w:r>
+          </w:p>
+        </w:tc>
+      </w:tr>
+      <w:tr>
+        <w:tc>
+          <w:tcPr/>
+          <w:p>
+            <w:pPr>
+              <w:pStyle w:val="Compact"/>
+            </w:pPr>
+            <w:r>
+              <w:t xml:space="preserve">ED Table 11</w:t>
+            </w:r>
+          </w:p>
+        </w:tc>
+        <w:tc>
+          <w:tcPr/>
+          <w:p>
+            <w:pPr>
+              <w:pStyle w:val="Compact"/>
+            </w:pPr>
+            <w:r>
+              <w:t xml:space="preserve">Displacement distances overall and by order (</w:t>
+            </w:r>
+            <w:r>
+              <w:rPr>
+                <w:rStyle w:val="VerbatimChar"/>
+              </w:rPr>
+              <w:t xml:space="preserve">table_J_distance_summary.csv</w:t>
+            </w:r>
+            <w:r>
+              <w:t xml:space="preserve">)</w:t>
+            </w:r>
+          </w:p>
+        </w:tc>
+      </w:tr>
     </w:tbl>
-    <w:bookmarkEnd w:id="33"/>
-    <w:bookmarkEnd w:id="34"/>
-    <w:bookmarkStart w:id="35" w:name="author-contributions"/>
+    <w:bookmarkEnd w:id="36"/>
+    <w:bookmarkEnd w:id="37"/>
+    <w:bookmarkStart w:id="38" w:name="author-contributions"/>
     <w:p>
       <w:pPr>
         <w:pStyle w:val="Heading2"/>
@@ -4677,8 +5673,8 @@
         <w:t xml:space="preserve">manuscript.</w:t>
       </w:r>
     </w:p>
-    <w:bookmarkEnd w:id="35"/>
-    <w:bookmarkStart w:id="36" w:name="competing-interests"/>
+    <w:bookmarkEnd w:id="38"/>
+    <w:bookmarkStart w:id="39" w:name="competing-interests"/>
     <w:p>
       <w:pPr>
         <w:pStyle w:val="Heading2"/>
@@ -4695,8 +5691,8 @@
         <w:t xml:space="preserve">The author declares no competing interests.</w:t>
       </w:r>
     </w:p>
-    <w:bookmarkEnd w:id="36"/>
-    <w:bookmarkStart w:id="37" w:name="additional-information"/>
+    <w:bookmarkEnd w:id="39"/>
+    <w:bookmarkStart w:id="40" w:name="additional-information"/>
     <w:p>
       <w:pPr>
         <w:pStyle w:val="Heading2"/>
@@ -4763,8 +5759,8 @@
         <w:t xml:space="preserve">responsibility.</w:t>
       </w:r>
     </w:p>
-    <w:bookmarkEnd w:id="37"/>
-    <w:bookmarkEnd w:id="38"/>
+    <w:bookmarkEnd w:id="40"/>
+    <w:bookmarkEnd w:id="41"/>
     <w:sectPr>
       <w:footnotePr>
         <w:numRestart w:val="eachSect"/>

</xml_diff>